<commit_message>
Fase 2: quita marcas de revisión y completa la declaración de uso de IA
Co-Authored-By: Claude Opus 5.5 (1M context) <noreply@anthropic.com>
Claude-Session: https://claude.ai/code/session_01MrtDhxuMPFWNK4KKuu4tRU
</commit_message>
<xml_diff>
--- a/Fase 2/Evidencias Grupales/2.1_APT122_DiarioReflexionFase2_Bastian_Reyes.docx
+++ b/Fase 2/Evidencias Grupales/2.1_APT122_DiarioReflexionFase2_Bastian_Reyes.docx
@@ -318,19 +318,6 @@
               <w:t>15-10-2026</w:t>
             </w:r>
           </w:p>
-          <w:p>
-            <w:r>
-              <w:rPr>
-                <w:rFonts w:ascii="Calibri" w:hAnsi="Calibri" w:eastAsia="Calibri"/>
-                <w:b w:val="0"/>
-                <w:i w:val="0"/>
-                <w:color w:val="000000"/>
-                <w:sz w:val="18"/>
-                <w:highlight w:val="yellow"/>
-              </w:rPr>
-              <w:t>El texto resaltado en amarillo corresponde a opiniones y reflexiones personales redactadas como borrador; el estudiante debe revisarlo y escribirlo con sus propias palabras antes de la entrega final.</w:t>
-            </w:r>
-          </w:p>
         </w:tc>
       </w:tr>
     </w:tbl>
@@ -521,7 +508,6 @@
                 <w:i w:val="0"/>
                 <w:color w:val="000000"/>
                 <w:sz w:val="22"/>
-                <w:highlight w:val="yellow"/>
               </w:rPr>
               <w:t>no haber leído la pauta de Fase 2 antes de la exposición.</w:t>
             </w:r>
@@ -674,7 +660,6 @@
                 <w:i w:val="0"/>
                 <w:color w:val="000000"/>
                 <w:sz w:val="22"/>
-                <w:highlight w:val="yellow"/>
               </w:rPr>
               <w:t>Para la dependencia de mi computador, voy a probar la guía "Instalar desde cero" en otro equipo y llevar a cada demostración un respaldo de la base y las capturas del recorrido completo.</w:t>
             </w:r>
@@ -911,7 +896,6 @@
                 <w:i w:val="0"/>
                 <w:color w:val="000000"/>
                 <w:sz w:val="22"/>
-                <w:highlight w:val="yellow"/>
               </w:rPr>
               <w:t>Evalúo mi trabajo técnico como bueno: la aplicación ya funciona de punta a punta (crear la feria y su plano, aprobar cuentas, solicitar, asignar con transacción y registrar el pago) y cada funcionalidad tiene evidencia en el código y en capturas.</w:t>
             </w:r>
@@ -927,7 +911,6 @@
                 <w:i w:val="0"/>
                 <w:color w:val="000000"/>
                 <w:sz w:val="22"/>
-                <w:highlight w:val="yellow"/>
               </w:rPr>
               <w:t>Lo que más destaco es haber ajustado el alcance a algo que se puede terminar y demostrar, en vez de intentar cubrir todos los tipos de ferias o pagos reales en línea.</w:t>
             </w:r>
@@ -943,7 +926,6 @@
                 <w:i w:val="0"/>
                 <w:color w:val="000000"/>
                 <w:sz w:val="22"/>
-                <w:highlight w:val="yellow"/>
               </w:rPr>
               <w:t>Lo que debo mejorar es la gestión de la documentación y de las pautas: me concentré en programar y descuidé lo que se evalúa en cada fase, y eso se reflejó en la nota de la exposición. También debo agregar pruebas automatizadas y casos de prueba documentados, que hoy son la parte más débil del proyecto.</w:t>
             </w:r>
@@ -1375,7 +1357,6 @@
                 <w:i w:val="0"/>
                 <w:color w:val="000000"/>
                 <w:sz w:val="22"/>
-                <w:highlight w:val="yellow"/>
               </w:rPr>
               <w:t>Como aspecto positivo, trabajar solo me permitió tomar decisiones rápido y mantener un solo criterio en el código y en el modelo de datos.</w:t>
             </w:r>
@@ -1391,7 +1372,6 @@
                 <w:i w:val="0"/>
                 <w:color w:val="000000"/>
                 <w:sz w:val="22"/>
-                <w:highlight w:val="yellow"/>
               </w:rPr>
               <w:t>Como aspecto por mejorar, no tengo a alguien que revise mi trabajo ni que me recuerde las entregas; por eso voy a pedir retroalimentación al docente y a compañeros del taller antes de cada exposición, y a usar las pautas como lista de control.</w:t>
             </w:r>

</xml_diff>